<commit_message>
Switch to "Inquiry" spelling and add contact form
- Replaced Enquiry/Enquiries with Inquiry/Inquiries site-wide.
- Added an inquiry form (name, email, referred by, message) to the
  Contact section; submits via mailto to kemissa@continuum.practice
  with a toast confirmation.

Co-Authored-By: Claude Opus 4.7 (1M context) <noreply@anthropic.com>
</commit_message>
<xml_diff>
--- a/website-copy.docx
+++ b/website-copy.docx
@@ -176,7 +176,7 @@
     </w:p>
     <w:p>
       <w:r>
-        <w:t>ENQUIRY</w:t>
+        <w:t>INQUIRY</w:t>
       </w:r>
     </w:p>
     <w:p>
@@ -521,7 +521,7 @@
         <w:pStyle w:val="Heading1"/>
       </w:pPr>
       <w:r>
-        <w:t>Enquiry (replaces Contact)</w:t>
+        <w:t>Inquiry (replaces Contact)</w:t>
       </w:r>
     </w:p>
     <w:p>
@@ -534,7 +534,7 @@
     </w:p>
     <w:p>
       <w:r>
-        <w:t>ENQUIRY</w:t>
+        <w:t>INQUIRY</w:t>
       </w:r>
     </w:p>
     <w:p>
@@ -589,12 +589,20 @@
         <w:rPr>
           <w:b/>
         </w:rPr>
-        <w:t>Response</w:t>
+        <w:t>Closing Paragraph</w:t>
       </w:r>
     </w:p>
     <w:p>
       <w:r>
-        <w:t>Enquiries are read directly by Kemissa. Replies are sent within seven days.</w:t>
+        <w:t>Inquiries are read directly by Kemissa. Replies are sent within seven days. The practice maintains a small client list and operates without public sales or marketing. Fit is determined before pricing is discussed.</w:t>
+      </w:r>
+    </w:p>
+    <w:p>
+      <w:pPr>
+        <w:pStyle w:val="Heading2"/>
+      </w:pPr>
+      <w:r>
+        <w:t>Inquiry Form</w:t>
       </w:r>
     </w:p>
     <w:p>
@@ -602,12 +610,103 @@
         <w:rPr>
           <w:b/>
         </w:rPr>
-        <w:t>Closing Paragraph</w:t>
+        <w:t>Field: Name</w:t>
       </w:r>
     </w:p>
     <w:p>
       <w:r>
-        <w:t>The practice maintains a small client list and operates without public sales or marketing. Fit is determined before pricing is discussed.</w:t>
+        <w:t>Label: NAME — required</w:t>
+      </w:r>
+    </w:p>
+    <w:p>
+      <w:r>
+        <w:rPr>
+          <w:b/>
+        </w:rPr>
+        <w:t>Field: Email</w:t>
+      </w:r>
+    </w:p>
+    <w:p>
+      <w:r>
+        <w:t>Label: EMAIL — required, email format</w:t>
+      </w:r>
+    </w:p>
+    <w:p>
+      <w:r>
+        <w:rPr>
+          <w:b/>
+        </w:rPr>
+        <w:t>Field: Referred by</w:t>
+      </w:r>
+    </w:p>
+    <w:p>
+      <w:r>
+        <w:t>Label: REFERRED BY — optional</w:t>
+      </w:r>
+    </w:p>
+    <w:p>
+      <w:r>
+        <w:rPr>
+          <w:b/>
+        </w:rPr>
+        <w:t>Field: Message</w:t>
+      </w:r>
+    </w:p>
+    <w:p>
+      <w:r>
+        <w:t>Label: MESSAGE — required, multi-line</w:t>
+      </w:r>
+    </w:p>
+    <w:p>
+      <w:r>
+        <w:rPr>
+          <w:b/>
+        </w:rPr>
+        <w:t>Submit Button</w:t>
+      </w:r>
+    </w:p>
+    <w:p>
+      <w:r>
+        <w:t>Send inquiry</w:t>
+      </w:r>
+    </w:p>
+    <w:p>
+      <w:r>
+        <w:rPr>
+          <w:b/>
+        </w:rPr>
+        <w:t>Submission Behavior</w:t>
+      </w:r>
+    </w:p>
+    <w:p>
+      <w:r>
+        <w:t>Form opens the user's email client with a prefilled message to kemissa@continuum.practice. No server dependency. A toast confirms the message is prepared.</w:t>
+      </w:r>
+    </w:p>
+    <w:p>
+      <w:r>
+        <w:rPr>
+          <w:b/>
+        </w:rPr>
+        <w:t>Toast — Title</w:t>
+      </w:r>
+    </w:p>
+    <w:p>
+      <w:r>
+        <w:t>Inquiry prepared</w:t>
+      </w:r>
+    </w:p>
+    <w:p>
+      <w:r>
+        <w:rPr>
+          <w:b/>
+        </w:rPr>
+        <w:t>Toast — Description</w:t>
+      </w:r>
+    </w:p>
+    <w:p>
+      <w:r>
+        <w:t>Your email client will open with the message ready to send.</w:t>
       </w:r>
     </w:p>
     <w:p>

</xml_diff>

<commit_message>
Deploy prep: domain email, OG meta, drop lovable tag
- Contact email → kemissa@continuumbykemissa.com (both component and page).
- OG image / og:url point at continuumbykemissa.com; twitter:image updated.
- Removed stray twitter:site "@lovable_dev" meta from template.

Note: og.jpg not yet added to public/; social previews will 404 until
the image file ships.

Co-Authored-By: Claude Opus 4.7 (1M context) <noreply@anthropic.com>
</commit_message>
<xml_diff>
--- a/website-copy.docx
+++ b/website-copy.docx
@@ -581,7 +581,7 @@
     </w:p>
     <w:p>
       <w:r>
-        <w:t>kemissa@continuum.practice</w:t>
+        <w:t>kemissa@continuumbykemissa.com</w:t>
       </w:r>
     </w:p>
     <w:p>
@@ -680,7 +680,7 @@
     </w:p>
     <w:p>
       <w:r>
-        <w:t>Form opens the user's email client with a prefilled message to kemissa@continuum.practice. No server dependency. A toast confirms the message is prepared.</w:t>
+        <w:t>Form opens the user's email client with a prefilled message to kemissa@continuumbykemissa.com. No server dependency. A toast confirms the message is prepared.</w:t>
       </w:r>
     </w:p>
     <w:p>

</xml_diff>